<commit_message>
Rød tråd: samme begreber fra use case til kode
Analyse:
- Use cases: forventet afgangstid i stedet for sluttid, lokale og
  indtjekningskode i UC02, UC01 skrevet, linjeskift i tabellerne
- Domæne- og objektmodel: ankomsttid, afgangstid, indtjekningstid,
  udtjekningstid og sikkerhedsfolder modtaget skrevet ens
- SSD: systemoperationer i camelCase med samme navne og parametre som SOC
- SOC: indtjekningskode ligger på Besøg (ikke gæstID), lokale tilføjet

Design og kode:
- DCD og SD rettet, så de beskriver præcis den kode, der findes
- Dialogen er flyttet fra Besøg/Medarbejder til Menu (controller)
- Besøg.Ansvarlig er en Medarbejder, status har konstanter
- Udvidelser fra UC01-UC06 er kodet (fejlbeskeder, datoformat)
- Login virker nu for alle medarbejdere, ikke kun den sidst oprettede
- Flere unit tests for Besøg og Medarbejder

Mapper og filer er omdøbt, så SOC ligger før SD og DCD, og filnavne
bruger use case-navnene.
</commit_message>
<xml_diff>
--- a/1. Use Case/Aktiv_UC02 Opret Besøg.docx
+++ b/1. Use Case/Aktiv_UC02 Opret Besøg.docx
@@ -649,7 +649,7 @@
                 <w:color w:val="000000"/>
                 <w:sz w:val="22"/>
               </w:rPr>
-              <w:t>Besøget er gemt med gæstens navn, firma, dato, forventet ankomsttid, forventet sluttid og ansvarlig medarbejder.</w:t>
+              <w:t>Besøget er gemt med gæstens navn, firma, dato, forventet ankomsttid, forventet afgangstid, lokale, ansvarlig og en indtjekningskode.</w:t>
             </w:r>
           </w:p>
           <w:p>
@@ -716,7 +716,7 @@
                 <w:color w:val="000000"/>
                 <w:sz w:val="22"/>
               </w:rPr>
-              <w:t>Medarbejderen vælger at oprette et nyt gæstebesøg.</w:t>
+              <w:t>Medarbejderen vælger at oprette et nyt besøg.</w:t>
             </w:r>
           </w:p>
           <w:p>
@@ -735,7 +735,7 @@
                 <w:color w:val="000000"/>
                 <w:sz w:val="22"/>
               </w:rPr>
-              <w:t>Systemet beder om gæstens navn, firma, dato, forventet ankomsttid, forventet sluttid samt den ansvarlige.</w:t>
+              <w:t>Systemet beder om gæstens navn, firma, dato, forventet ankomsttid, forventet afgangstid, lokale samt den ansvarlige.</w:t>
             </w:r>
           </w:p>
           <w:p>
@@ -773,7 +773,7 @@
                 <w:color w:val="000000"/>
                 <w:sz w:val="22"/>
               </w:rPr>
-              <w:t>Systemet gemmer besøget i listen.</w:t>
+              <w:t>Systemet gemmer besøget på gæstelisten og viser besøgets indtjekningskode.</w:t>
             </w:r>
           </w:p>
         </w:tc>
@@ -940,7 +940,7 @@
                 <w:color w:val="000000"/>
                 <w:sz w:val="22"/>
               </w:rPr>
-              <w:t>Sluttid ligger før ankomsttid</w:t>
+              <w:t>Forventet afgangstid ligger før forventet ankomsttid</w:t>
             </w:r>
           </w:p>
           <w:p>
@@ -957,7 +957,7 @@
               </w:rPr>
               <w:t>-</w:t>
               <w:tab/>
-              <w:t>Systemet viser fejlen "Sluttid skal være efter ankomsttid".</w:t>
+              <w:t>Systemet viser fejlen "Afgangstid skal være efter ankomsttid".</w:t>
             </w:r>
           </w:p>
           <w:p>
@@ -1036,7 +1036,7 @@
                 <w:color w:val="000000"/>
                 <w:sz w:val="22"/>
               </w:rPr>
-              <w:t>Dato indtastes i det rigtige format.</w:t>
+              <w:t>Dato indtastes i formatet dd-mm-åååå og tid i formatet tt:mm.</w:t>
             </w:r>
           </w:p>
           <w:p>

</xml_diff>